<commit_message>
Update exercise list, docs, and Release launch scheme
- Revise strength_exercises.csv
- Update High level requirements and Home docs
- Run the iOS scheme in Release (for sideloaded builds)
- Expand local Claude permissions and MCP settings

Co-Authored-By: Claude Opus 5.5 <noreply@anthropic.com>
</commit_message>
<xml_diff>
--- a/High level requirements.docx
+++ b/High level requirements.docx
@@ -2,8 +2,90 @@
 <file path=word/document.xml><?xml version="1.0" encoding="utf-8"?>
 <w:document xmlns:wpc="http://schemas.microsoft.com/office/word/2010/wordprocessingCanvas" xmlns:cx="http://schemas.microsoft.com/office/drawing/2014/chartex" xmlns:cx1="http://schemas.microsoft.com/office/drawing/2015/9/8/chartex" xmlns:cx2="http://schemas.microsoft.com/office/drawing/2015/10/21/chartex" xmlns:cx3="http://schemas.microsoft.com/office/drawing/2016/5/9/chartex" xmlns:cx4="http://schemas.microsoft.com/office/drawing/2016/5/10/chartex" xmlns:cx5="http://schemas.microsoft.com/office/drawing/2016/5/11/chartex" xmlns:cx6="http://schemas.microsoft.com/office/drawing/2016/5/12/chartex" xmlns:cx7="http://schemas.microsoft.com/office/drawing/2016/5/13/chartex" xmlns:cx8="http://schemas.microsoft.com/office/drawing/2016/5/14/chartex" xmlns:mc="http://schemas.openxmlformats.org/markup-compatibility/2006" xmlns:aink="http://schemas.microsoft.com/office/drawing/2016/ink" xmlns:am3d="http://schemas.microsoft.com/office/drawing/2017/model3d" xmlns:o="urn:schemas-microsoft-com:office:office" xmlns:oel="http://schemas.microsoft.com/office/2019/extlst" xmlns:r="http://schemas.openxmlformats.org/officeDocument/2006/relationships" xmlns:m="http://schemas.openxmlformats.org/officeDocument/2006/math" xmlns:v="urn:schemas-microsoft-com:vml" xmlns:wp14="http://schemas.microsoft.com/office/word/2010/wordprocessingDrawing" xmlns:wp="http://schemas.openxmlformats.org/drawingml/2006/wordprocessingDrawing" xmlns:w10="urn:schemas-microsoft-com:office:word" xmlns:w="http://schemas.openxmlformats.org/wordprocessingml/2006/main" xmlns:w14="http://schemas.microsoft.com/office/word/2010/wordml" xmlns:w15="http://schemas.microsoft.com/office/word/2012/wordml" xmlns:w16cex="http://schemas.microsoft.com/office/word/2018/wordml/cex" xmlns:w16cid="http://schemas.microsoft.com/office/word/2016/wordml/cid" xmlns:w16="http://schemas.microsoft.com/office/word/2018/wordml" xmlns:w16du="http://schemas.microsoft.com/office/word/2023/wordml/word16du" xmlns:w16sdtdh="http://schemas.microsoft.com/office/word/2020/wordml/sdtdatahash" xmlns:w16sdtfl="http://schemas.microsoft.com/office/word/2024/wordml/sdtformatlock" xmlns:w16se="http://schemas.microsoft.com/office/word/2015/wordml/symex" xmlns:wpg="http://schemas.microsoft.com/office/word/2010/wordprocessingGroup" xmlns:wpi="http://schemas.microsoft.com/office/word/2010/wordprocessingInk" xmlns:wne="http://schemas.microsoft.com/office/word/2006/wordml" xmlns:wps="http://schemas.microsoft.com/office/word/2010/wordprocessingShape" mc:Ignorable="w14 w15 w16se w16cid w16 w16cex w16sdtdh w16sdtfl w16du wp14">
   <w:body>
+    <w:p>
+      <w:r>
+        <w:t>Screens needed</w:t>
+      </w:r>
+    </w:p>
+    <w:p>
+      <w:pPr>
+        <w:pStyle w:val="ListParagraph"/>
+        <w:numPr>
+          <w:ilvl w:val="0"/>
+          <w:numId w:val="1"/>
+        </w:numPr>
+      </w:pPr>
+      <w:r>
+        <w:t>Login</w:t>
+      </w:r>
+    </w:p>
+    <w:p>
+      <w:pPr>
+        <w:pStyle w:val="ListParagraph"/>
+        <w:numPr>
+          <w:ilvl w:val="0"/>
+          <w:numId w:val="1"/>
+        </w:numPr>
+      </w:pPr>
+      <w:r>
+        <w:t>Initial setup pages</w:t>
+      </w:r>
+    </w:p>
+    <w:p>
+      <w:pPr>
+        <w:pStyle w:val="ListParagraph"/>
+        <w:numPr>
+          <w:ilvl w:val="0"/>
+          <w:numId w:val="1"/>
+        </w:numPr>
+      </w:pPr>
+      <w:r>
+        <w:t>Home</w:t>
+      </w:r>
+    </w:p>
+    <w:p>
+      <w:pPr>
+        <w:pStyle w:val="ListParagraph"/>
+        <w:numPr>
+          <w:ilvl w:val="0"/>
+          <w:numId w:val="1"/>
+        </w:numPr>
+      </w:pPr>
+      <w:r>
+        <w:t>Workout</w:t>
+      </w:r>
+    </w:p>
+    <w:p>
+      <w:pPr>
+        <w:pStyle w:val="ListParagraph"/>
+        <w:numPr>
+          <w:ilvl w:val="0"/>
+          <w:numId w:val="1"/>
+        </w:numPr>
+      </w:pPr>
+      <w:r>
+        <w:t>Progress</w:t>
+      </w:r>
+    </w:p>
+    <w:p>
+      <w:pPr>
+        <w:pStyle w:val="ListParagraph"/>
+        <w:numPr>
+          <w:ilvl w:val="0"/>
+          <w:numId w:val="1"/>
+        </w:numPr>
+      </w:pPr>
+      <w:r>
+        <w:t>Profile</w:t>
+      </w:r>
+    </w:p>
     <w:p/>
     <w:p>
+      <w:r>
+        <w:t>Functions</w:t>
+      </w:r>
+    </w:p>
+    <w:p>
       <w:pPr>
         <w:pStyle w:val="ListParagraph"/>
         <w:numPr>
@@ -255,6 +337,12 @@
         <w:t>Water consumption</w:t>
       </w:r>
     </w:p>
+    <w:p/>
+    <w:p>
+      <w:r>
+        <w:t>Data Structure</w:t>
+      </w:r>
+    </w:p>
     <w:p>
       <w:pPr>
         <w:pStyle w:val="ListParagraph"/>
@@ -263,9 +351,773 @@
           <w:numId w:val="1"/>
         </w:numPr>
       </w:pPr>
+      <w:r>
+        <w:t>Home</w:t>
+      </w:r>
+    </w:p>
+    <w:p>
+      <w:pPr>
+        <w:pStyle w:val="ListParagraph"/>
+        <w:numPr>
+          <w:ilvl w:val="1"/>
+          <w:numId w:val="1"/>
+        </w:numPr>
+      </w:pPr>
+      <w:bookmarkStart w:id="0" w:name="OLE_LINK7"/>
+      <w:r>
+        <w:t>Workouts</w:t>
+      </w:r>
+    </w:p>
+    <w:p>
+      <w:pPr>
+        <w:pStyle w:val="ListParagraph"/>
+        <w:numPr>
+          <w:ilvl w:val="2"/>
+          <w:numId w:val="1"/>
+        </w:numPr>
+      </w:pPr>
+      <w:proofErr w:type="gramStart"/>
+      <w:r>
+        <w:t>id  /</w:t>
+      </w:r>
+      <w:proofErr w:type="gramEnd"/>
+      <w:r>
+        <w:t>/ timestamp + random suffix</w:t>
+      </w:r>
+    </w:p>
+    <w:p>
+      <w:pPr>
+        <w:pStyle w:val="ListParagraph"/>
+        <w:numPr>
+          <w:ilvl w:val="2"/>
+          <w:numId w:val="1"/>
+        </w:numPr>
+      </w:pPr>
+      <w:proofErr w:type="spellStart"/>
+      <w:r>
+        <w:lastRenderedPageBreak/>
+        <w:t>completedAt</w:t>
+      </w:r>
+      <w:proofErr w:type="spellEnd"/>
+      <w:r>
+        <w:t xml:space="preserve"> // ISO string</w:t>
+      </w:r>
+    </w:p>
+    <w:p>
+      <w:pPr>
+        <w:pStyle w:val="ListParagraph"/>
+        <w:numPr>
+          <w:ilvl w:val="2"/>
+          <w:numId w:val="1"/>
+        </w:numPr>
+      </w:pPr>
+      <w:r>
+        <w:t>Session –</w:t>
+      </w:r>
+      <w:r>
+        <w:t xml:space="preserve"> Session workout name. </w:t>
+      </w:r>
+    </w:p>
+    <w:p>
+      <w:pPr>
+        <w:pStyle w:val="ListParagraph"/>
+        <w:numPr>
+          <w:ilvl w:val="2"/>
+          <w:numId w:val="1"/>
+        </w:numPr>
+      </w:pPr>
+      <w:r>
+        <w:t>Exercise –</w:t>
+      </w:r>
+      <w:r>
+        <w:t xml:space="preserve"> Each session can have multiple exercises</w:t>
+      </w:r>
+    </w:p>
+    <w:p>
+      <w:pPr>
+        <w:pStyle w:val="ListParagraph"/>
+        <w:numPr>
+          <w:ilvl w:val="2"/>
+          <w:numId w:val="1"/>
+        </w:numPr>
+      </w:pPr>
+      <w:r>
+        <w:t>Set -</w:t>
+      </w:r>
+      <w:r>
+        <w:t xml:space="preserve"> Each Exercise can have multiple sets</w:t>
+      </w:r>
+      <w:r>
+        <w:t xml:space="preserve"> </w:t>
+      </w:r>
+    </w:p>
+    <w:p>
+      <w:pPr>
+        <w:pStyle w:val="ListParagraph"/>
+        <w:numPr>
+          <w:ilvl w:val="2"/>
+          <w:numId w:val="1"/>
+        </w:numPr>
+      </w:pPr>
+      <w:r>
+        <w:t xml:space="preserve">Reps – Numerical value to show how many repetitions was done in a set </w:t>
+      </w:r>
+    </w:p>
+    <w:p>
+      <w:pPr>
+        <w:pStyle w:val="ListParagraph"/>
+        <w:numPr>
+          <w:ilvl w:val="2"/>
+          <w:numId w:val="1"/>
+        </w:numPr>
+      </w:pPr>
+      <w:r>
+        <w:t>Weight – Numerical value to show the weight used in the set</w:t>
+      </w:r>
+    </w:p>
+    <w:p>
+      <w:pPr>
+        <w:pStyle w:val="ListParagraph"/>
+        <w:numPr>
+          <w:ilvl w:val="2"/>
+          <w:numId w:val="1"/>
+        </w:numPr>
+      </w:pPr>
+      <w:proofErr w:type="spellStart"/>
+      <w:r>
+        <w:t>exerciseCount</w:t>
+      </w:r>
+      <w:proofErr w:type="spellEnd"/>
+      <w:r>
+        <w:t xml:space="preserve"> </w:t>
+      </w:r>
+      <w:r>
+        <w:t>// number of exercises</w:t>
+      </w:r>
+    </w:p>
+    <w:p>
+      <w:pPr>
+        <w:pStyle w:val="ListParagraph"/>
+        <w:numPr>
+          <w:ilvl w:val="2"/>
+          <w:numId w:val="1"/>
+        </w:numPr>
+      </w:pPr>
+      <w:proofErr w:type="spellStart"/>
+      <w:r>
+        <w:t>caloriesBurned</w:t>
+      </w:r>
+      <w:proofErr w:type="spellEnd"/>
+      <w:r>
+        <w:t>:</w:t>
+      </w:r>
+    </w:p>
+    <w:p>
+      <w:pPr>
+        <w:pStyle w:val="ListParagraph"/>
+        <w:numPr>
+          <w:ilvl w:val="2"/>
+          <w:numId w:val="1"/>
+        </w:numPr>
+      </w:pPr>
+      <w:r>
+        <w:t xml:space="preserve">notes: </w:t>
+      </w:r>
+    </w:p>
+    <w:p>
+      <w:pPr>
+        <w:pStyle w:val="ListParagraph"/>
+        <w:numPr>
+          <w:ilvl w:val="0"/>
+          <w:numId w:val="2"/>
+        </w:numPr>
+      </w:pPr>
+      <w:r>
+        <w:t xml:space="preserve">Each day/date can have multiple sessions. </w:t>
+      </w:r>
+    </w:p>
+    <w:p>
+      <w:pPr>
+        <w:pStyle w:val="ListParagraph"/>
+        <w:numPr>
+          <w:ilvl w:val="0"/>
+          <w:numId w:val="2"/>
+        </w:numPr>
+      </w:pPr>
+      <w:r>
+        <w:t xml:space="preserve">Each session can have multiple exercises. </w:t>
+      </w:r>
+    </w:p>
+    <w:p>
+      <w:pPr>
+        <w:pStyle w:val="ListParagraph"/>
+        <w:numPr>
+          <w:ilvl w:val="0"/>
+          <w:numId w:val="2"/>
+        </w:numPr>
+      </w:pPr>
+      <w:r>
+        <w:t xml:space="preserve">Each exercise can have multiple sets. </w:t>
+      </w:r>
+    </w:p>
+    <w:p>
+      <w:pPr>
+        <w:pStyle w:val="ListParagraph"/>
+        <w:numPr>
+          <w:ilvl w:val="0"/>
+          <w:numId w:val="2"/>
+        </w:numPr>
+      </w:pPr>
+      <w:r>
+        <w:t xml:space="preserve">Each set can have multiple reps. </w:t>
+      </w:r>
+    </w:p>
+    <w:p>
+      <w:pPr>
+        <w:pStyle w:val="ListParagraph"/>
+        <w:numPr>
+          <w:ilvl w:val="0"/>
+          <w:numId w:val="2"/>
+        </w:numPr>
+      </w:pPr>
+      <w:r>
+        <w:t>Each set can only have a single weight</w:t>
+      </w:r>
+    </w:p>
+    <w:bookmarkEnd w:id="0"/>
+    <w:p>
+      <w:pPr>
+        <w:pStyle w:val="ListParagraph"/>
+        <w:numPr>
+          <w:ilvl w:val="1"/>
+          <w:numId w:val="1"/>
+        </w:numPr>
+      </w:pPr>
+      <w:r>
+        <w:t>Progress</w:t>
+      </w:r>
+    </w:p>
+    <w:p>
+      <w:pPr>
+        <w:pStyle w:val="ListParagraph"/>
+        <w:numPr>
+          <w:ilvl w:val="1"/>
+          <w:numId w:val="1"/>
+        </w:numPr>
+      </w:pPr>
+      <w:r>
+        <w:t>Profile</w:t>
+      </w:r>
+    </w:p>
+    <w:p>
+      <w:pPr>
+        <w:pStyle w:val="ListParagraph"/>
+        <w:numPr>
+          <w:ilvl w:val="2"/>
+          <w:numId w:val="1"/>
+        </w:numPr>
+      </w:pPr>
+      <w:r>
+        <w:t>Full Name</w:t>
+      </w:r>
+    </w:p>
+    <w:p>
+      <w:pPr>
+        <w:pStyle w:val="ListParagraph"/>
+        <w:numPr>
+          <w:ilvl w:val="2"/>
+          <w:numId w:val="1"/>
+        </w:numPr>
+      </w:pPr>
+      <w:r>
+        <w:t>User ID</w:t>
+      </w:r>
+    </w:p>
+    <w:p>
+      <w:pPr>
+        <w:pStyle w:val="ListParagraph"/>
+        <w:numPr>
+          <w:ilvl w:val="2"/>
+          <w:numId w:val="1"/>
+        </w:numPr>
+      </w:pPr>
+      <w:r>
+        <w:t>Email</w:t>
+      </w:r>
+    </w:p>
+    <w:p>
+      <w:pPr>
+        <w:pStyle w:val="ListParagraph"/>
+        <w:numPr>
+          <w:ilvl w:val="2"/>
+          <w:numId w:val="1"/>
+        </w:numPr>
+      </w:pPr>
+      <w:r>
+        <w:t>Phone Number</w:t>
+      </w:r>
     </w:p>
     <w:p/>
     <w:p/>
+    <w:p>
+      <w:pPr>
+        <w:pStyle w:val="ListParagraph"/>
+        <w:numPr>
+          <w:ilvl w:val="0"/>
+          <w:numId w:val="3"/>
+        </w:numPr>
+      </w:pPr>
+      <w:r>
+        <w:t>Login flow</w:t>
+      </w:r>
+    </w:p>
+    <w:p>
+      <w:pPr>
+        <w:pStyle w:val="ListParagraph"/>
+        <w:numPr>
+          <w:ilvl w:val="1"/>
+          <w:numId w:val="3"/>
+        </w:numPr>
+      </w:pPr>
+      <w:r>
+        <w:t xml:space="preserve">Main login screen </w:t>
+      </w:r>
+      <w:r>
+        <w:sym w:font="Wingdings" w:char="F0E0"/>
+      </w:r>
+      <w:r>
+        <w:t xml:space="preserve"> Login via username and password (Biometrics for subsequent logins)</w:t>
+      </w:r>
+    </w:p>
+    <w:p>
+      <w:pPr>
+        <w:pStyle w:val="ListParagraph"/>
+        <w:numPr>
+          <w:ilvl w:val="0"/>
+          <w:numId w:val="3"/>
+        </w:numPr>
+      </w:pPr>
+      <w:r>
+        <w:t>Create acc</w:t>
+      </w:r>
+    </w:p>
+    <w:p>
+      <w:pPr>
+        <w:pStyle w:val="ListParagraph"/>
+        <w:numPr>
+          <w:ilvl w:val="1"/>
+          <w:numId w:val="3"/>
+        </w:numPr>
+      </w:pPr>
+      <w:r>
+        <w:t xml:space="preserve">Main login screen </w:t>
+      </w:r>
+      <w:r>
+        <w:sym w:font="Wingdings" w:char="F0E0"/>
+      </w:r>
+      <w:r>
+        <w:t xml:space="preserve"> Create acc </w:t>
+      </w:r>
+      <w:r>
+        <w:sym w:font="Wingdings" w:char="F0E0"/>
+      </w:r>
+      <w:r>
+        <w:t xml:space="preserve"> Using </w:t>
+      </w:r>
+      <w:proofErr w:type="gramStart"/>
+      <w:r>
+        <w:t>Gmail ,</w:t>
+      </w:r>
+      <w:proofErr w:type="gramEnd"/>
+      <w:r>
+        <w:t xml:space="preserve"> Apple ID </w:t>
+      </w:r>
+      <w:r>
+        <w:sym w:font="Wingdings" w:char="F0E0"/>
+      </w:r>
+      <w:r>
+        <w:t xml:space="preserve"> Create Username and password </w:t>
+      </w:r>
+      <w:r>
+        <w:sym w:font="Wingdings" w:char="F0E0"/>
+      </w:r>
+      <w:r>
+        <w:t xml:space="preserve"> </w:t>
+      </w:r>
+    </w:p>
+    <w:p/>
+    <w:p/>
+    <w:p/>
+    <w:p/>
+    <w:p/>
+    <w:p>
+      <w:bookmarkStart w:id="1" w:name="OLE_LINK1"/>
+      <w:r>
+        <w:lastRenderedPageBreak/>
+        <w:t>In Workouts tab</w:t>
+      </w:r>
+    </w:p>
+    <w:p>
+      <w:r>
+        <w:t>Exercise log</w:t>
+      </w:r>
+    </w:p>
+    <w:p>
+      <w:pPr>
+        <w:pStyle w:val="ListParagraph"/>
+        <w:numPr>
+          <w:ilvl w:val="0"/>
+          <w:numId w:val="6"/>
+        </w:numPr>
+      </w:pPr>
+      <w:r>
+        <w:t>Allow users to indicate any of the sets as warmup set</w:t>
+      </w:r>
+    </w:p>
+    <w:p>
+      <w:pPr>
+        <w:pStyle w:val="ListParagraph"/>
+        <w:numPr>
+          <w:ilvl w:val="0"/>
+          <w:numId w:val="6"/>
+        </w:numPr>
+      </w:pPr>
+      <w:r>
+        <w:t>Add a visual indicator for warmup sets</w:t>
+      </w:r>
+    </w:p>
+    <w:bookmarkEnd w:id="1"/>
+    <w:p/>
+    <w:p>
+      <w:bookmarkStart w:id="2" w:name="OLE_LINK2"/>
+      <w:r>
+        <w:t>Progress tab</w:t>
+      </w:r>
+    </w:p>
+    <w:p>
+      <w:bookmarkStart w:id="3" w:name="OLE_LINK3"/>
+      <w:r>
+        <w:t xml:space="preserve">Add a </w:t>
+      </w:r>
+      <w:r>
+        <w:t>Custom range selection</w:t>
+      </w:r>
+      <w:r>
+        <w:br/>
+        <w:t xml:space="preserve">user click on custom range </w:t>
+      </w:r>
+      <w:r>
+        <w:sym w:font="Wingdings" w:char="F0E0"/>
+      </w:r>
+      <w:r>
+        <w:t xml:space="preserve"> User select start and end date </w:t>
+      </w:r>
+      <w:r>
+        <w:sym w:font="Wingdings" w:char="F0E0"/>
+      </w:r>
+      <w:r>
+        <w:t xml:space="preserve"> data from that range is displayed</w:t>
+      </w:r>
+      <w:r>
+        <w:t xml:space="preserve"> </w:t>
+      </w:r>
+    </w:p>
+    <w:p>
+      <w:r>
+        <w:t xml:space="preserve">Above the recent sessions section, add a </w:t>
+      </w:r>
+      <w:r>
+        <w:t>Stats</w:t>
+      </w:r>
+      <w:r>
+        <w:t xml:space="preserve"> section. It is meant to be a summary of the selected time range. Stats to display, </w:t>
+      </w:r>
+    </w:p>
+    <w:p>
+      <w:pPr>
+        <w:pStyle w:val="ListParagraph"/>
+        <w:numPr>
+          <w:ilvl w:val="0"/>
+          <w:numId w:val="4"/>
+        </w:numPr>
+      </w:pPr>
+      <w:r>
+        <w:t>Total Sessions</w:t>
+      </w:r>
+    </w:p>
+    <w:p>
+      <w:pPr>
+        <w:pStyle w:val="ListParagraph"/>
+        <w:numPr>
+          <w:ilvl w:val="0"/>
+          <w:numId w:val="4"/>
+        </w:numPr>
+      </w:pPr>
+      <w:r>
+        <w:t>Total Sets (toggle include or exclude warmup sets)</w:t>
+      </w:r>
+    </w:p>
+    <w:p>
+      <w:pPr>
+        <w:pStyle w:val="ListParagraph"/>
+        <w:numPr>
+          <w:ilvl w:val="0"/>
+          <w:numId w:val="4"/>
+        </w:numPr>
+      </w:pPr>
+      <w:r>
+        <w:t>PB</w:t>
+      </w:r>
+      <w:bookmarkEnd w:id="2"/>
+    </w:p>
+    <w:p>
+      <w:pPr>
+        <w:pStyle w:val="ListParagraph"/>
+        <w:numPr>
+          <w:ilvl w:val="0"/>
+          <w:numId w:val="4"/>
+        </w:numPr>
+      </w:pPr>
+      <w:r>
+        <w:t>% of improvement (can be negative. If % is negative, show in red, if positive show in green)</w:t>
+      </w:r>
+    </w:p>
+    <w:bookmarkEnd w:id="3"/>
+    <w:p/>
+    <w:p/>
+    <w:p>
+      <w:r>
+        <w:t>Things to do</w:t>
+      </w:r>
+    </w:p>
+    <w:p>
+      <w:pPr>
+        <w:pStyle w:val="ListParagraph"/>
+        <w:numPr>
+          <w:ilvl w:val="0"/>
+          <w:numId w:val="4"/>
+        </w:numPr>
+      </w:pPr>
+      <w:r>
+        <w:t xml:space="preserve">Switch to </w:t>
+      </w:r>
+      <w:proofErr w:type="spellStart"/>
+      <w:r>
+        <w:t>tsx</w:t>
+      </w:r>
+      <w:proofErr w:type="spellEnd"/>
+      <w:r>
+        <w:t xml:space="preserve">. And </w:t>
+      </w:r>
+      <w:proofErr w:type="spellStart"/>
+      <w:r>
+        <w:t>ts</w:t>
+      </w:r>
+      <w:proofErr w:type="spellEnd"/>
+    </w:p>
+    <w:p/>
+    <w:p/>
+    <w:p>
+      <w:r>
+        <w:br w:type="page"/>
+      </w:r>
+    </w:p>
+    <w:p>
+      <w:proofErr w:type="spellStart"/>
+      <w:r>
+        <w:lastRenderedPageBreak/>
+        <w:t>Homescreen</w:t>
+      </w:r>
+      <w:proofErr w:type="spellEnd"/>
+    </w:p>
+    <w:p>
+      <w:pPr>
+        <w:pStyle w:val="ListParagraph"/>
+        <w:numPr>
+          <w:ilvl w:val="0"/>
+          <w:numId w:val="4"/>
+        </w:numPr>
+      </w:pPr>
+      <w:r>
+        <w:t>Today’s session (if already setup in profile)</w:t>
+      </w:r>
+    </w:p>
+    <w:p>
+      <w:pPr>
+        <w:pStyle w:val="ListParagraph"/>
+        <w:numPr>
+          <w:ilvl w:val="0"/>
+          <w:numId w:val="4"/>
+        </w:numPr>
+      </w:pPr>
+      <w:r>
+        <w:t>Log body metrics</w:t>
+      </w:r>
+    </w:p>
+    <w:p>
+      <w:pPr>
+        <w:pStyle w:val="ListParagraph"/>
+        <w:numPr>
+          <w:ilvl w:val="0"/>
+          <w:numId w:val="4"/>
+        </w:numPr>
+      </w:pPr>
+      <w:r>
+        <w:t>Daily metrics (progress bar against goal if setup, else just normal display)</w:t>
+      </w:r>
+      <w:bookmarkStart w:id="4" w:name="OLE_LINK4"/>
+      <w:r>
+        <w:t xml:space="preserve"> </w:t>
+      </w:r>
+      <w:bookmarkEnd w:id="4"/>
+    </w:p>
+    <w:p>
+      <w:pPr>
+        <w:pStyle w:val="ListParagraph"/>
+        <w:numPr>
+          <w:ilvl w:val="1"/>
+          <w:numId w:val="4"/>
+        </w:numPr>
+      </w:pPr>
+      <w:r>
+        <w:t xml:space="preserve">HR </w:t>
+      </w:r>
+      <w:r>
+        <w:t>(current with graph of today’s upon clicking on card)</w:t>
+      </w:r>
+    </w:p>
+    <w:p>
+      <w:pPr>
+        <w:pStyle w:val="ListParagraph"/>
+        <w:numPr>
+          <w:ilvl w:val="1"/>
+          <w:numId w:val="4"/>
+        </w:numPr>
+      </w:pPr>
+      <w:r>
+        <w:t>Sleep (Phase 2)</w:t>
+      </w:r>
+    </w:p>
+    <w:p>
+      <w:pPr>
+        <w:pStyle w:val="ListParagraph"/>
+        <w:numPr>
+          <w:ilvl w:val="1"/>
+          <w:numId w:val="4"/>
+        </w:numPr>
+      </w:pPr>
+      <w:r>
+        <w:t>Calories</w:t>
+      </w:r>
+      <w:r>
+        <w:t xml:space="preserve"> </w:t>
+      </w:r>
+    </w:p>
+    <w:p>
+      <w:pPr>
+        <w:pStyle w:val="ListParagraph"/>
+        <w:numPr>
+          <w:ilvl w:val="2"/>
+          <w:numId w:val="4"/>
+        </w:numPr>
+      </w:pPr>
+      <w:r>
+        <w:t>Consumed</w:t>
+      </w:r>
+      <w:r>
+        <w:t xml:space="preserve"> </w:t>
+      </w:r>
+      <w:r>
+        <w:t>(</w:t>
+      </w:r>
+      <w:r>
+        <w:t>total</w:t>
+      </w:r>
+      <w:r>
+        <w:t xml:space="preserve"> with graph of today’s upon clicking on card)</w:t>
+      </w:r>
+    </w:p>
+    <w:p>
+      <w:pPr>
+        <w:pStyle w:val="ListParagraph"/>
+        <w:numPr>
+          <w:ilvl w:val="2"/>
+          <w:numId w:val="4"/>
+        </w:numPr>
+      </w:pPr>
+      <w:r>
+        <w:t>Burned</w:t>
+      </w:r>
+      <w:r>
+        <w:t xml:space="preserve"> </w:t>
+      </w:r>
+      <w:r>
+        <w:t>(</w:t>
+      </w:r>
+      <w:r>
+        <w:t xml:space="preserve">total </w:t>
+      </w:r>
+      <w:r>
+        <w:t>with graph of today’s upon clicking on card)</w:t>
+      </w:r>
+    </w:p>
+    <w:p>
+      <w:pPr>
+        <w:pStyle w:val="ListParagraph"/>
+        <w:numPr>
+          <w:ilvl w:val="1"/>
+          <w:numId w:val="4"/>
+        </w:numPr>
+      </w:pPr>
+      <w:r>
+        <w:t>Steps</w:t>
+      </w:r>
+      <w:r>
+        <w:t xml:space="preserve"> </w:t>
+      </w:r>
+      <w:r>
+        <w:t>(</w:t>
+      </w:r>
+      <w:r>
+        <w:t>total</w:t>
+      </w:r>
+      <w:r>
+        <w:t xml:space="preserve"> with graph of today’s upon clicking on card)</w:t>
+      </w:r>
+    </w:p>
+    <w:p>
+      <w:pPr>
+        <w:pStyle w:val="ListParagraph"/>
+        <w:numPr>
+          <w:ilvl w:val="1"/>
+          <w:numId w:val="4"/>
+        </w:numPr>
+      </w:pPr>
+      <w:r>
+        <w:t>Distance</w:t>
+      </w:r>
+      <w:r>
+        <w:t xml:space="preserve"> </w:t>
+      </w:r>
+      <w:r>
+        <w:t>(</w:t>
+      </w:r>
+      <w:r>
+        <w:t>total</w:t>
+      </w:r>
+      <w:r>
+        <w:t xml:space="preserve"> with graph of today’s upon clicking on card)</w:t>
+      </w:r>
+    </w:p>
+    <w:p>
+      <w:pPr>
+        <w:pStyle w:val="ListParagraph"/>
+        <w:numPr>
+          <w:ilvl w:val="1"/>
+          <w:numId w:val="4"/>
+        </w:numPr>
+      </w:pPr>
+    </w:p>
     <w:sectPr>
       <w:pgSz w:w="12240" w:h="15840"/>
       <w:pgMar w:top="1440" w:right="1440" w:bottom="1440" w:left="1440" w:header="720" w:footer="720" w:gutter="0"/>
@@ -367,8 +1219,546 @@
       </w:pPr>
     </w:lvl>
   </w:abstractNum>
+  <w:abstractNum w:abstractNumId="1" w15:restartNumberingAfterBreak="0">
+    <w:nsid w:val="071740BD"/>
+    <w:multiLevelType w:val="hybridMultilevel"/>
+    <w:tmpl w:val="44723FBE"/>
+    <w:lvl w:ilvl="0" w:tplc="72AE113A">
+      <w:start w:val="1"/>
+      <w:numFmt w:val="bullet"/>
+      <w:lvlText w:val="-"/>
+      <w:lvlJc w:val="left"/>
+      <w:pPr>
+        <w:ind w:left="720" w:hanging="360"/>
+      </w:pPr>
+      <w:rPr>
+        <w:rFonts w:ascii="Aptos" w:eastAsiaTheme="minorHAnsi" w:hAnsi="Aptos" w:cstheme="minorBidi" w:hint="default"/>
+      </w:rPr>
+    </w:lvl>
+    <w:lvl w:ilvl="1" w:tplc="04090003">
+      <w:start w:val="1"/>
+      <w:numFmt w:val="bullet"/>
+      <w:lvlText w:val="o"/>
+      <w:lvlJc w:val="left"/>
+      <w:pPr>
+        <w:ind w:left="1440" w:hanging="360"/>
+      </w:pPr>
+      <w:rPr>
+        <w:rFonts w:ascii="Courier New" w:hAnsi="Courier New" w:hint="default"/>
+      </w:rPr>
+    </w:lvl>
+    <w:lvl w:ilvl="2" w:tplc="04090005">
+      <w:start w:val="1"/>
+      <w:numFmt w:val="bullet"/>
+      <w:lvlText w:val=""/>
+      <w:lvlJc w:val="left"/>
+      <w:pPr>
+        <w:ind w:left="2160" w:hanging="360"/>
+      </w:pPr>
+      <w:rPr>
+        <w:rFonts w:ascii="Wingdings" w:hAnsi="Wingdings" w:hint="default"/>
+      </w:rPr>
+    </w:lvl>
+    <w:lvl w:ilvl="3" w:tplc="04090001" w:tentative="1">
+      <w:start w:val="1"/>
+      <w:numFmt w:val="bullet"/>
+      <w:lvlText w:val=""/>
+      <w:lvlJc w:val="left"/>
+      <w:pPr>
+        <w:ind w:left="2880" w:hanging="360"/>
+      </w:pPr>
+      <w:rPr>
+        <w:rFonts w:ascii="Symbol" w:hAnsi="Symbol" w:hint="default"/>
+      </w:rPr>
+    </w:lvl>
+    <w:lvl w:ilvl="4" w:tplc="04090003" w:tentative="1">
+      <w:start w:val="1"/>
+      <w:numFmt w:val="bullet"/>
+      <w:lvlText w:val="o"/>
+      <w:lvlJc w:val="left"/>
+      <w:pPr>
+        <w:ind w:left="3600" w:hanging="360"/>
+      </w:pPr>
+      <w:rPr>
+        <w:rFonts w:ascii="Courier New" w:hAnsi="Courier New" w:hint="default"/>
+      </w:rPr>
+    </w:lvl>
+    <w:lvl w:ilvl="5" w:tplc="04090005" w:tentative="1">
+      <w:start w:val="1"/>
+      <w:numFmt w:val="bullet"/>
+      <w:lvlText w:val=""/>
+      <w:lvlJc w:val="left"/>
+      <w:pPr>
+        <w:ind w:left="4320" w:hanging="360"/>
+      </w:pPr>
+      <w:rPr>
+        <w:rFonts w:ascii="Wingdings" w:hAnsi="Wingdings" w:hint="default"/>
+      </w:rPr>
+    </w:lvl>
+    <w:lvl w:ilvl="6" w:tplc="04090001" w:tentative="1">
+      <w:start w:val="1"/>
+      <w:numFmt w:val="bullet"/>
+      <w:lvlText w:val=""/>
+      <w:lvlJc w:val="left"/>
+      <w:pPr>
+        <w:ind w:left="5040" w:hanging="360"/>
+      </w:pPr>
+      <w:rPr>
+        <w:rFonts w:ascii="Symbol" w:hAnsi="Symbol" w:hint="default"/>
+      </w:rPr>
+    </w:lvl>
+    <w:lvl w:ilvl="7" w:tplc="04090003" w:tentative="1">
+      <w:start w:val="1"/>
+      <w:numFmt w:val="bullet"/>
+      <w:lvlText w:val="o"/>
+      <w:lvlJc w:val="left"/>
+      <w:pPr>
+        <w:ind w:left="5760" w:hanging="360"/>
+      </w:pPr>
+      <w:rPr>
+        <w:rFonts w:ascii="Courier New" w:hAnsi="Courier New" w:hint="default"/>
+      </w:rPr>
+    </w:lvl>
+    <w:lvl w:ilvl="8" w:tplc="04090005" w:tentative="1">
+      <w:start w:val="1"/>
+      <w:numFmt w:val="bullet"/>
+      <w:lvlText w:val=""/>
+      <w:lvlJc w:val="left"/>
+      <w:pPr>
+        <w:ind w:left="6480" w:hanging="360"/>
+      </w:pPr>
+      <w:rPr>
+        <w:rFonts w:ascii="Wingdings" w:hAnsi="Wingdings" w:hint="default"/>
+      </w:rPr>
+    </w:lvl>
+  </w:abstractNum>
+  <w:abstractNum w:abstractNumId="2" w15:restartNumberingAfterBreak="0">
+    <w:nsid w:val="339476EF"/>
+    <w:multiLevelType w:val="hybridMultilevel"/>
+    <w:tmpl w:val="1C2AF478"/>
+    <w:lvl w:ilvl="0" w:tplc="04090001">
+      <w:start w:val="1"/>
+      <w:numFmt w:val="bullet"/>
+      <w:lvlText w:val=""/>
+      <w:lvlJc w:val="left"/>
+      <w:pPr>
+        <w:ind w:left="720" w:hanging="360"/>
+      </w:pPr>
+      <w:rPr>
+        <w:rFonts w:ascii="Symbol" w:hAnsi="Symbol" w:hint="default"/>
+      </w:rPr>
+    </w:lvl>
+    <w:lvl w:ilvl="1" w:tplc="04090003" w:tentative="1">
+      <w:start w:val="1"/>
+      <w:numFmt w:val="bullet"/>
+      <w:lvlText w:val="o"/>
+      <w:lvlJc w:val="left"/>
+      <w:pPr>
+        <w:ind w:left="1440" w:hanging="360"/>
+      </w:pPr>
+      <w:rPr>
+        <w:rFonts w:ascii="Courier New" w:hAnsi="Courier New" w:cs="Courier New" w:hint="default"/>
+      </w:rPr>
+    </w:lvl>
+    <w:lvl w:ilvl="2" w:tplc="04090005" w:tentative="1">
+      <w:start w:val="1"/>
+      <w:numFmt w:val="bullet"/>
+      <w:lvlText w:val=""/>
+      <w:lvlJc w:val="left"/>
+      <w:pPr>
+        <w:ind w:left="2160" w:hanging="360"/>
+      </w:pPr>
+      <w:rPr>
+        <w:rFonts w:ascii="Wingdings" w:hAnsi="Wingdings" w:hint="default"/>
+      </w:rPr>
+    </w:lvl>
+    <w:lvl w:ilvl="3" w:tplc="04090001" w:tentative="1">
+      <w:start w:val="1"/>
+      <w:numFmt w:val="bullet"/>
+      <w:lvlText w:val=""/>
+      <w:lvlJc w:val="left"/>
+      <w:pPr>
+        <w:ind w:left="2880" w:hanging="360"/>
+      </w:pPr>
+      <w:rPr>
+        <w:rFonts w:ascii="Symbol" w:hAnsi="Symbol" w:hint="default"/>
+      </w:rPr>
+    </w:lvl>
+    <w:lvl w:ilvl="4" w:tplc="04090003" w:tentative="1">
+      <w:start w:val="1"/>
+      <w:numFmt w:val="bullet"/>
+      <w:lvlText w:val="o"/>
+      <w:lvlJc w:val="left"/>
+      <w:pPr>
+        <w:ind w:left="3600" w:hanging="360"/>
+      </w:pPr>
+      <w:rPr>
+        <w:rFonts w:ascii="Courier New" w:hAnsi="Courier New" w:cs="Courier New" w:hint="default"/>
+      </w:rPr>
+    </w:lvl>
+    <w:lvl w:ilvl="5" w:tplc="04090005" w:tentative="1">
+      <w:start w:val="1"/>
+      <w:numFmt w:val="bullet"/>
+      <w:lvlText w:val=""/>
+      <w:lvlJc w:val="left"/>
+      <w:pPr>
+        <w:ind w:left="4320" w:hanging="360"/>
+      </w:pPr>
+      <w:rPr>
+        <w:rFonts w:ascii="Wingdings" w:hAnsi="Wingdings" w:hint="default"/>
+      </w:rPr>
+    </w:lvl>
+    <w:lvl w:ilvl="6" w:tplc="04090001" w:tentative="1">
+      <w:start w:val="1"/>
+      <w:numFmt w:val="bullet"/>
+      <w:lvlText w:val=""/>
+      <w:lvlJc w:val="left"/>
+      <w:pPr>
+        <w:ind w:left="5040" w:hanging="360"/>
+      </w:pPr>
+      <w:rPr>
+        <w:rFonts w:ascii="Symbol" w:hAnsi="Symbol" w:hint="default"/>
+      </w:rPr>
+    </w:lvl>
+    <w:lvl w:ilvl="7" w:tplc="04090003" w:tentative="1">
+      <w:start w:val="1"/>
+      <w:numFmt w:val="bullet"/>
+      <w:lvlText w:val="o"/>
+      <w:lvlJc w:val="left"/>
+      <w:pPr>
+        <w:ind w:left="5760" w:hanging="360"/>
+      </w:pPr>
+      <w:rPr>
+        <w:rFonts w:ascii="Courier New" w:hAnsi="Courier New" w:cs="Courier New" w:hint="default"/>
+      </w:rPr>
+    </w:lvl>
+    <w:lvl w:ilvl="8" w:tplc="04090005" w:tentative="1">
+      <w:start w:val="1"/>
+      <w:numFmt w:val="bullet"/>
+      <w:lvlText w:val=""/>
+      <w:lvlJc w:val="left"/>
+      <w:pPr>
+        <w:ind w:left="6480" w:hanging="360"/>
+      </w:pPr>
+      <w:rPr>
+        <w:rFonts w:ascii="Wingdings" w:hAnsi="Wingdings" w:hint="default"/>
+      </w:rPr>
+    </w:lvl>
+  </w:abstractNum>
+  <w:abstractNum w:abstractNumId="3" w15:restartNumberingAfterBreak="0">
+    <w:nsid w:val="484259EA"/>
+    <w:multiLevelType w:val="hybridMultilevel"/>
+    <w:tmpl w:val="547A3962"/>
+    <w:lvl w:ilvl="0" w:tplc="FFFFFFFF">
+      <w:start w:val="1"/>
+      <w:numFmt w:val="decimal"/>
+      <w:lvlText w:val="%1."/>
+      <w:lvlJc w:val="left"/>
+      <w:pPr>
+        <w:ind w:left="720" w:hanging="360"/>
+      </w:pPr>
+      <w:rPr>
+        <w:rFonts w:hint="default"/>
+      </w:rPr>
+    </w:lvl>
+    <w:lvl w:ilvl="1" w:tplc="FFFFFFFF">
+      <w:start w:val="1"/>
+      <w:numFmt w:val="lowerLetter"/>
+      <w:lvlText w:val="%2."/>
+      <w:lvlJc w:val="left"/>
+      <w:pPr>
+        <w:ind w:left="1440" w:hanging="360"/>
+      </w:pPr>
+    </w:lvl>
+    <w:lvl w:ilvl="2" w:tplc="FFFFFFFF">
+      <w:start w:val="1"/>
+      <w:numFmt w:val="lowerRoman"/>
+      <w:lvlText w:val="%3."/>
+      <w:lvlJc w:val="right"/>
+      <w:pPr>
+        <w:ind w:left="2160" w:hanging="180"/>
+      </w:pPr>
+    </w:lvl>
+    <w:lvl w:ilvl="3" w:tplc="FFFFFFFF">
+      <w:start w:val="1"/>
+      <w:numFmt w:val="decimal"/>
+      <w:lvlText w:val="%4."/>
+      <w:lvlJc w:val="left"/>
+      <w:pPr>
+        <w:ind w:left="2880" w:hanging="360"/>
+      </w:pPr>
+    </w:lvl>
+    <w:lvl w:ilvl="4" w:tplc="FFFFFFFF">
+      <w:start w:val="1"/>
+      <w:numFmt w:val="lowerLetter"/>
+      <w:lvlText w:val="%5."/>
+      <w:lvlJc w:val="left"/>
+      <w:pPr>
+        <w:ind w:left="3600" w:hanging="360"/>
+      </w:pPr>
+    </w:lvl>
+    <w:lvl w:ilvl="5" w:tplc="C20AB422">
+      <w:start w:val="1"/>
+      <w:numFmt w:val="bullet"/>
+      <w:lvlText w:val="-"/>
+      <w:lvlJc w:val="left"/>
+      <w:pPr>
+        <w:ind w:left="4500" w:hanging="360"/>
+      </w:pPr>
+      <w:rPr>
+        <w:rFonts w:ascii="Aptos" w:eastAsiaTheme="minorHAnsi" w:hAnsi="Aptos" w:cstheme="minorBidi" w:hint="default"/>
+      </w:rPr>
+    </w:lvl>
+    <w:lvl w:ilvl="6" w:tplc="FFFFFFFF" w:tentative="1">
+      <w:start w:val="1"/>
+      <w:numFmt w:val="decimal"/>
+      <w:lvlText w:val="%7."/>
+      <w:lvlJc w:val="left"/>
+      <w:pPr>
+        <w:ind w:left="5040" w:hanging="360"/>
+      </w:pPr>
+    </w:lvl>
+    <w:lvl w:ilvl="7" w:tplc="FFFFFFFF" w:tentative="1">
+      <w:start w:val="1"/>
+      <w:numFmt w:val="lowerLetter"/>
+      <w:lvlText w:val="%8."/>
+      <w:lvlJc w:val="left"/>
+      <w:pPr>
+        <w:ind w:left="5760" w:hanging="360"/>
+      </w:pPr>
+    </w:lvl>
+    <w:lvl w:ilvl="8" w:tplc="FFFFFFFF" w:tentative="1">
+      <w:start w:val="1"/>
+      <w:numFmt w:val="lowerRoman"/>
+      <w:lvlText w:val="%9."/>
+      <w:lvlJc w:val="right"/>
+      <w:pPr>
+        <w:ind w:left="6480" w:hanging="180"/>
+      </w:pPr>
+    </w:lvl>
+  </w:abstractNum>
+  <w:abstractNum w:abstractNumId="4" w15:restartNumberingAfterBreak="0">
+    <w:nsid w:val="59782894"/>
+    <w:multiLevelType w:val="hybridMultilevel"/>
+    <w:tmpl w:val="547A3962"/>
+    <w:lvl w:ilvl="0" w:tplc="FFFFFFFF">
+      <w:start w:val="1"/>
+      <w:numFmt w:val="decimal"/>
+      <w:lvlText w:val="%1."/>
+      <w:lvlJc w:val="left"/>
+      <w:pPr>
+        <w:ind w:left="720" w:hanging="360"/>
+      </w:pPr>
+      <w:rPr>
+        <w:rFonts w:hint="default"/>
+      </w:rPr>
+    </w:lvl>
+    <w:lvl w:ilvl="1" w:tplc="FFFFFFFF">
+      <w:start w:val="1"/>
+      <w:numFmt w:val="lowerLetter"/>
+      <w:lvlText w:val="%2."/>
+      <w:lvlJc w:val="left"/>
+      <w:pPr>
+        <w:ind w:left="1440" w:hanging="360"/>
+      </w:pPr>
+    </w:lvl>
+    <w:lvl w:ilvl="2" w:tplc="FFFFFFFF">
+      <w:start w:val="1"/>
+      <w:numFmt w:val="lowerRoman"/>
+      <w:lvlText w:val="%3."/>
+      <w:lvlJc w:val="right"/>
+      <w:pPr>
+        <w:ind w:left="2160" w:hanging="180"/>
+      </w:pPr>
+    </w:lvl>
+    <w:lvl w:ilvl="3" w:tplc="FFFFFFFF">
+      <w:start w:val="1"/>
+      <w:numFmt w:val="decimal"/>
+      <w:lvlText w:val="%4."/>
+      <w:lvlJc w:val="left"/>
+      <w:pPr>
+        <w:ind w:left="2880" w:hanging="360"/>
+      </w:pPr>
+    </w:lvl>
+    <w:lvl w:ilvl="4" w:tplc="FFFFFFFF">
+      <w:start w:val="1"/>
+      <w:numFmt w:val="lowerLetter"/>
+      <w:lvlText w:val="%5."/>
+      <w:lvlJc w:val="left"/>
+      <w:pPr>
+        <w:ind w:left="3600" w:hanging="360"/>
+      </w:pPr>
+    </w:lvl>
+    <w:lvl w:ilvl="5" w:tplc="FFFFFFFF">
+      <w:start w:val="1"/>
+      <w:numFmt w:val="bullet"/>
+      <w:lvlText w:val="-"/>
+      <w:lvlJc w:val="left"/>
+      <w:pPr>
+        <w:ind w:left="4500" w:hanging="360"/>
+      </w:pPr>
+      <w:rPr>
+        <w:rFonts w:ascii="Aptos" w:eastAsiaTheme="minorHAnsi" w:hAnsi="Aptos" w:cstheme="minorBidi" w:hint="default"/>
+      </w:rPr>
+    </w:lvl>
+    <w:lvl w:ilvl="6" w:tplc="FFFFFFFF" w:tentative="1">
+      <w:start w:val="1"/>
+      <w:numFmt w:val="decimal"/>
+      <w:lvlText w:val="%7."/>
+      <w:lvlJc w:val="left"/>
+      <w:pPr>
+        <w:ind w:left="5040" w:hanging="360"/>
+      </w:pPr>
+    </w:lvl>
+    <w:lvl w:ilvl="7" w:tplc="FFFFFFFF" w:tentative="1">
+      <w:start w:val="1"/>
+      <w:numFmt w:val="lowerLetter"/>
+      <w:lvlText w:val="%8."/>
+      <w:lvlJc w:val="left"/>
+      <w:pPr>
+        <w:ind w:left="5760" w:hanging="360"/>
+      </w:pPr>
+    </w:lvl>
+    <w:lvl w:ilvl="8" w:tplc="FFFFFFFF" w:tentative="1">
+      <w:start w:val="1"/>
+      <w:numFmt w:val="lowerRoman"/>
+      <w:lvlText w:val="%9."/>
+      <w:lvlJc w:val="right"/>
+      <w:pPr>
+        <w:ind w:left="6480" w:hanging="180"/>
+      </w:pPr>
+    </w:lvl>
+  </w:abstractNum>
+  <w:abstractNum w:abstractNumId="5" w15:restartNumberingAfterBreak="0">
+    <w:nsid w:val="745E1ADF"/>
+    <w:multiLevelType w:val="hybridMultilevel"/>
+    <w:tmpl w:val="330A6D12"/>
+    <w:lvl w:ilvl="0" w:tplc="04090001">
+      <w:start w:val="1"/>
+      <w:numFmt w:val="bullet"/>
+      <w:lvlText w:val=""/>
+      <w:lvlJc w:val="left"/>
+      <w:pPr>
+        <w:ind w:left="720" w:hanging="360"/>
+      </w:pPr>
+      <w:rPr>
+        <w:rFonts w:ascii="Symbol" w:hAnsi="Symbol" w:hint="default"/>
+      </w:rPr>
+    </w:lvl>
+    <w:lvl w:ilvl="1" w:tplc="04090003" w:tentative="1">
+      <w:start w:val="1"/>
+      <w:numFmt w:val="bullet"/>
+      <w:lvlText w:val="o"/>
+      <w:lvlJc w:val="left"/>
+      <w:pPr>
+        <w:ind w:left="1440" w:hanging="360"/>
+      </w:pPr>
+      <w:rPr>
+        <w:rFonts w:ascii="Courier New" w:hAnsi="Courier New" w:hint="default"/>
+      </w:rPr>
+    </w:lvl>
+    <w:lvl w:ilvl="2" w:tplc="04090005" w:tentative="1">
+      <w:start w:val="1"/>
+      <w:numFmt w:val="bullet"/>
+      <w:lvlText w:val=""/>
+      <w:lvlJc w:val="left"/>
+      <w:pPr>
+        <w:ind w:left="2160" w:hanging="360"/>
+      </w:pPr>
+      <w:rPr>
+        <w:rFonts w:ascii="Wingdings" w:hAnsi="Wingdings" w:hint="default"/>
+      </w:rPr>
+    </w:lvl>
+    <w:lvl w:ilvl="3" w:tplc="04090001" w:tentative="1">
+      <w:start w:val="1"/>
+      <w:numFmt w:val="bullet"/>
+      <w:lvlText w:val=""/>
+      <w:lvlJc w:val="left"/>
+      <w:pPr>
+        <w:ind w:left="2880" w:hanging="360"/>
+      </w:pPr>
+      <w:rPr>
+        <w:rFonts w:ascii="Symbol" w:hAnsi="Symbol" w:hint="default"/>
+      </w:rPr>
+    </w:lvl>
+    <w:lvl w:ilvl="4" w:tplc="04090003" w:tentative="1">
+      <w:start w:val="1"/>
+      <w:numFmt w:val="bullet"/>
+      <w:lvlText w:val="o"/>
+      <w:lvlJc w:val="left"/>
+      <w:pPr>
+        <w:ind w:left="3600" w:hanging="360"/>
+      </w:pPr>
+      <w:rPr>
+        <w:rFonts w:ascii="Courier New" w:hAnsi="Courier New" w:hint="default"/>
+      </w:rPr>
+    </w:lvl>
+    <w:lvl w:ilvl="5" w:tplc="04090005" w:tentative="1">
+      <w:start w:val="1"/>
+      <w:numFmt w:val="bullet"/>
+      <w:lvlText w:val=""/>
+      <w:lvlJc w:val="left"/>
+      <w:pPr>
+        <w:ind w:left="4320" w:hanging="360"/>
+      </w:pPr>
+      <w:rPr>
+        <w:rFonts w:ascii="Wingdings" w:hAnsi="Wingdings" w:hint="default"/>
+      </w:rPr>
+    </w:lvl>
+    <w:lvl w:ilvl="6" w:tplc="04090001" w:tentative="1">
+      <w:start w:val="1"/>
+      <w:numFmt w:val="bullet"/>
+      <w:lvlText w:val=""/>
+      <w:lvlJc w:val="left"/>
+      <w:pPr>
+        <w:ind w:left="5040" w:hanging="360"/>
+      </w:pPr>
+      <w:rPr>
+        <w:rFonts w:ascii="Symbol" w:hAnsi="Symbol" w:hint="default"/>
+      </w:rPr>
+    </w:lvl>
+    <w:lvl w:ilvl="7" w:tplc="04090003" w:tentative="1">
+      <w:start w:val="1"/>
+      <w:numFmt w:val="bullet"/>
+      <w:lvlText w:val="o"/>
+      <w:lvlJc w:val="left"/>
+      <w:pPr>
+        <w:ind w:left="5760" w:hanging="360"/>
+      </w:pPr>
+      <w:rPr>
+        <w:rFonts w:ascii="Courier New" w:hAnsi="Courier New" w:hint="default"/>
+      </w:rPr>
+    </w:lvl>
+    <w:lvl w:ilvl="8" w:tplc="04090005" w:tentative="1">
+      <w:start w:val="1"/>
+      <w:numFmt w:val="bullet"/>
+      <w:lvlText w:val=""/>
+      <w:lvlJc w:val="left"/>
+      <w:pPr>
+        <w:ind w:left="6480" w:hanging="360"/>
+      </w:pPr>
+      <w:rPr>
+        <w:rFonts w:ascii="Wingdings" w:hAnsi="Wingdings" w:hint="default"/>
+      </w:rPr>
+    </w:lvl>
+  </w:abstractNum>
   <w:num w:numId="1" w16cid:durableId="1764573153">
     <w:abstractNumId w:val="0"/>
+  </w:num>
+  <w:num w:numId="2" w16cid:durableId="456725422">
+    <w:abstractNumId w:val="2"/>
+  </w:num>
+  <w:num w:numId="3" w16cid:durableId="1052658639">
+    <w:abstractNumId w:val="3"/>
+  </w:num>
+  <w:num w:numId="4" w16cid:durableId="857349783">
+    <w:abstractNumId w:val="1"/>
+  </w:num>
+  <w:num w:numId="5" w16cid:durableId="1743674497">
+    <w:abstractNumId w:val="4"/>
+  </w:num>
+  <w:num w:numId="6" w16cid:durableId="2008633241">
+    <w:abstractNumId w:val="5"/>
   </w:num>
 </w:numbering>
 </file>

</xml_diff>